<commit_message>
Add working paper, analysis report, master document, descriptive analysis and black-and-white figures
- Working paper (Ch. 1-6, three objectives) rendered from a template with scripted numbers
- Descriptive statistics and trend analysis for Objective 1 (D11): summary, annual,
  fuel-shock episodes, cross-correlations, regional summary, ADF tests
- Analysis and results report listing every estimate, generated from output tables
- Master document: process narrative plus all project documents and code as appendices
- All figures redrawn in black and white without in-image titles (PNG/TIFF 300 dpi, PDF);
  new trend, regional and conceptual framework figures
- README for the replication package; run_all.sh builds every document

Co-Authored-By: Claude Opus 5.5 <noreply@anthropic.com>
Claude-Session: https://claude.ai/code/session_01BJh4xwEjPS1QoGpFfUAH88
</commit_message>
<xml_diff>
--- a/paper/manuscript.docx
+++ b/paper/manuscript.docx
@@ -9056,7 +9056,7 @@
       <w:r>
         <w:drawing>
           <wp:inline>
-            <wp:extent cx="4397390" cy="3129177"/>
+            <wp:extent cx="4391566" cy="2886935"/>
             <wp:effectExtent b="0" l="0" r="0" t="0"/>
             <wp:docPr descr="Figure 1. Cumulative pass-through of a 1% fuel price increase to the price level, all income and bottom 30% households, with 90% bands." title="" id="106" name="Picture"/>
             <a:graphic>
@@ -9077,7 +9077,7 @@
                   <pic:spPr bwMode="auto">
                     <a:xfrm>
                       <a:off x="0" y="0"/>
-                      <a:ext cx="4397390" cy="3129177"/>
+                      <a:ext cx="4391566" cy="2886935"/>
                     </a:xfrm>
                     <a:prstGeom prst="rect">
                       <a:avLst/>
@@ -9111,7 +9111,7 @@
       <w:r>
         <w:drawing>
           <wp:inline>
-            <wp:extent cx="5334000" cy="2322459"/>
+            <wp:extent cx="5334000" cy="2264952"/>
             <wp:effectExtent b="0" l="0" r="0" t="0"/>
             <wp:docPr descr="Figure 2. Cumulative response of ln(CPI all/CPI bottom 30%) to a 1% fuel price increase, national and 17-region panel. Negative values mean the bottom 30% face larger price increases." title="" id="109" name="Picture"/>
             <a:graphic>
@@ -9132,7 +9132,7 @@
                   <pic:spPr bwMode="auto">
                     <a:xfrm>
                       <a:off x="0" y="0"/>
-                      <a:ext cx="5334000" cy="2322459"/>
+                      <a:ext cx="5334000" cy="2264952"/>
                     </a:xfrm>
                     <a:prstGeom prst="rect">
                       <a:avLst/>
@@ -9166,7 +9166,7 @@
       <w:r>
         <w:drawing>
           <wp:inline>
-            <wp:extent cx="4800600" cy="2420446"/>
+            <wp:extent cx="4800600" cy="2293704"/>
             <wp:effectExtent b="0" l="0" r="0" t="0"/>
             <wp:docPr descr="Figure 3. Cumulative pass-through after 12 months by CPI division, with 90% confidence intervals." title="" id="112" name="Picture"/>
             <a:graphic>
@@ -9187,7 +9187,7 @@
                   <pic:spPr bwMode="auto">
                     <a:xfrm>
                       <a:off x="0" y="0"/>
-                      <a:ext cx="4800600" cy="2420446"/>
+                      <a:ext cx="4800600" cy="2293704"/>
                     </a:xfrm>
                     <a:prstGeom prst="rect">
                       <a:avLst/>
@@ -9221,7 +9221,7 @@
       <w:r>
         <w:drawing>
           <wp:inline>
-            <wp:extent cx="4533900" cy="2064812"/>
+            <wp:extent cx="4533900" cy="1802241"/>
             <wp:effectExtent b="0" l="0" r="0" t="0"/>
             <wp:docPr descr="Figure 4. Additional distributional effect in groups of regions after 12 months, with 90% confidence intervals." title="" id="115" name="Picture"/>
             <a:graphic>
@@ -9242,7 +9242,7 @@
                   <pic:spPr bwMode="auto">
                     <a:xfrm>
                       <a:off x="0" y="0"/>
-                      <a:ext cx="4533900" cy="2064812"/>
+                      <a:ext cx="4533900" cy="1802241"/>
                     </a:xfrm>
                     <a:prstGeom prst="rect">
                       <a:avLst/>
@@ -9276,7 +9276,7 @@
       <w:r>
         <w:drawing>
           <wp:inline>
-            <wp:extent cx="4800600" cy="3353529"/>
+            <wp:extent cx="4800600" cy="3110858"/>
             <wp:effectExtent b="0" l="0" r="0" t="0"/>
             <wp:docPr descr="Figure 5. Robustness of the six-month distributional effect, with 90% confidence intervals." title="" id="118" name="Picture"/>
             <a:graphic>
@@ -9297,7 +9297,7 @@
                   <pic:spPr bwMode="auto">
                     <a:xfrm>
                       <a:off x="0" y="0"/>
-                      <a:ext cx="4800600" cy="3353529"/>
+                      <a:ext cx="4800600" cy="3110858"/>
                     </a:xfrm>
                     <a:prstGeom prst="rect">
                       <a:avLst/>
@@ -9331,7 +9331,7 @@
       <w:r>
         <w:drawing>
           <wp:inline>
-            <wp:extent cx="5334000" cy="2528359"/>
+            <wp:extent cx="5334000" cy="2520845"/>
             <wp:effectExtent b="0" l="0" r="0" t="0"/>
             <wp:docPr descr="Figure 6. Actual price changes in 2026 against the fuel-driven changes predicted by a model estimated on 2001–2025 data." title="" id="121" name="Picture"/>
             <a:graphic>
@@ -9352,7 +9352,7 @@
                   <pic:spPr bwMode="auto">
                     <a:xfrm>
                       <a:off x="0" y="0"/>
-                      <a:ext cx="5334000" cy="2528359"/>
+                      <a:ext cx="5334000" cy="2520845"/>
                     </a:xfrm>
                     <a:prstGeom prst="rect">
                       <a:avLst/>
@@ -9386,7 +9386,7 @@
       <w:r>
         <w:drawing>
           <wp:inline>
-            <wp:extent cx="4800600" cy="2441214"/>
+            <wp:extent cx="4800600" cy="2242829"/>
             <wp:effectExtent b="0" l="0" r="0" t="0"/>
             <wp:docPr descr="Figure 7. Item contributions to the difference between bottom-30% and all-income price changes, December 2025 to August 2026." title="" id="124" name="Picture"/>
             <a:graphic>
@@ -9407,7 +9407,7 @@
                   <pic:spPr bwMode="auto">
                     <a:xfrm>
                       <a:off x="0" y="0"/>
-                      <a:ext cx="4800600" cy="2441214"/>
+                      <a:ext cx="4800600" cy="2242829"/>
                     </a:xfrm>
                     <a:prstGeom prst="rect">
                       <a:avLst/>

</xml_diff>